<commit_message>
Lokale KiCad-Staende vom 2026-10-17/18 uebernehmen
Die Arbeit lag nur lokal (nicht auf GitHub) und wurde beim Abgleich
nach der Umbenennung ueberschrieben. Wiederhergestellt aus
backups/vor-umbenennung, Dateinamen und Projektverweise auf
RC-Multiswitch angepasst.

Co-Authored-By: Claude Opus 5.5 (1M context) <noreply@anthropic.com>
Claude-Session: https://claude.ai/code/session_01Np9GkYmRMGJmd89YiKPa21
</commit_message>
<xml_diff>
--- a/docs/Projektbeschreibung.docx
+++ b/docs/Projektbeschreibung.docx
@@ -23,7 +23,7 @@
           <w:iCs/>
           <w:color w:val="666666"/>
         </w:rPr>
-        <w:t xml:space="preserve">Projektbeschreibung, Stand 16.10.2026, Hardware v0.1 (Entwurf, nur Schaltplan)</w:t>
+        <w:t xml:space="preserve">Projektbeschreibung, Stand 17.10.2026, Hardware v0.8 (Entwurf, nur Schaltplan)</w:t>
       </w:r>
     </w:p>
     <w:p>
@@ -91,31 +91,19 @@
         </w:numPr>
       </w:pPr>
       <w:r>
-        <w:t xml:space="preserve">Audio wahlweise: A) PCM5102A-DAC mit externem TPA3116D2-Verstaerker (aus VLOAD) oder B) MAX98357A mit Gain-Jumper</w:t>
-      </w:r>
-    </w:p>
-    <w:p>
-      <w:pPr>
-        <w:pStyle w:val="ListParagraph"/>
-        <w:numPr>
-          <w:ilvl w:val="0"/>
-          <w:numId w:val="2"/>
-        </w:numPr>
-      </w:pPr>
-      <w:r>
-        <w:t xml:space="preserve">microSD-Kartenmodul (6-polig) ueber SPI, Versorgung per Jumper 5 V oder 3,3 V</w:t>
-      </w:r>
-    </w:p>
-    <w:p>
-      <w:pPr>
-        <w:pStyle w:val="ListParagraph"/>
-        <w:numPr>
-          <w:ilvl w:val="0"/>
-          <w:numId w:val="2"/>
-        </w:numPr>
-      </w:pPr>
-      <w:r>
-        <w:t xml:space="preserve">Setup-Taster</w:t>
+        <w:t xml:space="preserve">Audio: PCM5102A-DAC mit externem TPA3118-Verstaerker (HW-327, mono, aus VLOAD; Quelle mono, Kanal L direkt, kein Mono-Mix)</w:t>
+      </w:r>
+    </w:p>
+    <w:p>
+      <w:pPr>
+        <w:pStyle w:val="ListParagraph"/>
+        <w:numPr>
+          <w:ilvl w:val="0"/>
+          <w:numId w:val="2"/>
+        </w:numPr>
+      </w:pPr>
+      <w:r>
+        <w:t xml:space="preserve">microSD-Kartenmodul (6-polig) ueber SPI, Versorgung fest 3,3 V vom ESP32-Board (nur reine 3,3-V-Module)</w:t>
       </w:r>
     </w:p>
     <w:p>
@@ -151,7 +139,7 @@
         </w:numPr>
       </w:pPr>
       <w:r>
-        <w:t xml:space="preserve">Lastspannung 12-24 V (VLOAD) an CN2 (JST PH 2), TVS-Diode P6KE33A als Schutz.</w:t>
+        <w:t xml:space="preserve">Lastspannung 3S LiPo, 9-12,6 V (VLOAD) an CN2 (JST PH 2), TVS-Diode P6KE15A als Schutz.</w:t>
       </w:r>
     </w:p>
     <w:p>
@@ -627,120 +615,6 @@
           </w:p>
         </w:tc>
       </w:tr>
-      <w:tr>
-        <w:trPr>
-          <w:tblHeader w:val="false"/>
-        </w:trPr>
-        <w:tc>
-          <w:tcPr>
-            <w:tcW w:type="dxa" w:w="3200"/>
-            <w:tcBorders>
-              <w:top w:val="single" w:color="999999" w:sz="4"/>
-              <w:left w:val="single" w:color="999999" w:sz="4"/>
-              <w:bottom w:val="single" w:color="999999" w:sz="4"/>
-              <w:right w:val="single" w:color="999999" w:sz="4"/>
-            </w:tcBorders>
-            <w:tcMar>
-              <w:top w:type="dxa" w:w="60"/>
-              <w:left w:type="dxa" w:w="100"/>
-              <w:bottom w:type="dxa" w:w="60"/>
-              <w:right w:type="dxa" w:w="100"/>
-            </w:tcMar>
-          </w:tcPr>
-          <w:p>
-            <w:r>
-              <w:rPr>
-                <w:b w:val="false"/>
-                <w:bCs w:val="false"/>
-              </w:rPr>
-              <w:t xml:space="preserve">Amp-Mute (MAX98357A SD)</w:t>
-            </w:r>
-          </w:p>
-        </w:tc>
-        <w:tc>
-          <w:tcPr>
-            <w:tcW w:type="dxa" w:w="5826"/>
-            <w:tcBorders>
-              <w:top w:val="single" w:color="999999" w:sz="4"/>
-              <w:left w:val="single" w:color="999999" w:sz="4"/>
-              <w:bottom w:val="single" w:color="999999" w:sz="4"/>
-              <w:right w:val="single" w:color="999999" w:sz="4"/>
-            </w:tcBorders>
-            <w:tcMar>
-              <w:top w:type="dxa" w:w="60"/>
-              <w:left w:type="dxa" w:w="100"/>
-              <w:bottom w:type="dxa" w:w="60"/>
-              <w:right w:type="dxa" w:w="100"/>
-            </w:tcMar>
-          </w:tcPr>
-          <w:p>
-            <w:r>
-              <w:rPr>
-                <w:b w:val="false"/>
-                <w:bCs w:val="false"/>
-              </w:rPr>
-              <w:t xml:space="preserve">IO8</w:t>
-            </w:r>
-          </w:p>
-        </w:tc>
-      </w:tr>
-      <w:tr>
-        <w:trPr>
-          <w:tblHeader w:val="false"/>
-        </w:trPr>
-        <w:tc>
-          <w:tcPr>
-            <w:tcW w:type="dxa" w:w="3200"/>
-            <w:tcBorders>
-              <w:top w:val="single" w:color="999999" w:sz="4"/>
-              <w:left w:val="single" w:color="999999" w:sz="4"/>
-              <w:bottom w:val="single" w:color="999999" w:sz="4"/>
-              <w:right w:val="single" w:color="999999" w:sz="4"/>
-            </w:tcBorders>
-            <w:tcMar>
-              <w:top w:type="dxa" w:w="60"/>
-              <w:left w:type="dxa" w:w="100"/>
-              <w:bottom w:type="dxa" w:w="60"/>
-              <w:right w:type="dxa" w:w="100"/>
-            </w:tcMar>
-          </w:tcPr>
-          <w:p>
-            <w:r>
-              <w:rPr>
-                <w:b w:val="false"/>
-                <w:bCs w:val="false"/>
-              </w:rPr>
-              <w:t xml:space="preserve">Setup-Taster</w:t>
-            </w:r>
-          </w:p>
-        </w:tc>
-        <w:tc>
-          <w:tcPr>
-            <w:tcW w:type="dxa" w:w="5826"/>
-            <w:tcBorders>
-              <w:top w:val="single" w:color="999999" w:sz="4"/>
-              <w:left w:val="single" w:color="999999" w:sz="4"/>
-              <w:bottom w:val="single" w:color="999999" w:sz="4"/>
-              <w:right w:val="single" w:color="999999" w:sz="4"/>
-            </w:tcBorders>
-            <w:tcMar>
-              <w:top w:type="dxa" w:w="60"/>
-              <w:left w:type="dxa" w:w="100"/>
-              <w:bottom w:type="dxa" w:w="60"/>
-              <w:right w:type="dxa" w:w="100"/>
-            </w:tcMar>
-          </w:tcPr>
-          <w:p>
-            <w:r>
-              <w:rPr>
-                <w:b w:val="false"/>
-                <w:bCs w:val="false"/>
-              </w:rPr>
-              <w:t xml:space="preserve">IO9</w:t>
-            </w:r>
-          </w:p>
-        </w:tc>
-      </w:tr>
     </w:tbl>
     <w:p>
       <w:pPr>
@@ -771,31 +645,43 @@
         </w:numPr>
       </w:pPr>
       <w:r>
-        <w:t xml:space="preserve">CN2 Last 12-24 V (JST PH 2), CN3 Versorgung TPA3116D2 aus VLOAD</w:t>
-      </w:r>
-    </w:p>
-    <w:p>
-      <w:pPr>
-        <w:pStyle w:val="ListParagraph"/>
-        <w:numPr>
-          <w:ilvl w:val="0"/>
-          <w:numId w:val="2"/>
-        </w:numPr>
-      </w:pPr>
-      <w:r>
-        <w:t xml:space="preserve">J2 PCM5102A-Modul, J3 MAX98357A-Modul, J4 Gain-Jumper</w:t>
-      </w:r>
-    </w:p>
-    <w:p>
-      <w:pPr>
-        <w:pStyle w:val="ListParagraph"/>
-        <w:numPr>
-          <w:ilvl w:val="0"/>
-          <w:numId w:val="2"/>
-        </w:numPr>
-      </w:pPr>
-      <w:r>
-        <w:t xml:space="preserve">J8 Jumper SD-Versorgung, J9 microSD-Modul, J7 Setup-Taster</w:t>
+        <w:t xml:space="preserve">CN2 Last 3S LiPo (9-12,6 V) (JST PH 2), CN4 Lautsprecherausgang (JST PH 2, SPK+ / SPK-)</w:t>
+      </w:r>
+    </w:p>
+    <w:p>
+      <w:pPr>
+        <w:pStyle w:val="ListParagraph"/>
+        <w:numPr>
+          <w:ilvl w:val="0"/>
+          <w:numId w:val="2"/>
+        </w:numPr>
+      </w:pPr>
+      <w:r>
+        <w:t xml:space="preserve">J2 PCM5102A-Modul: Pin 1-6 = Stiftleiste (VIN, GND, LCK, DIN, BCK, SCK), Pin 7-10 = Ausgangspads G, R, G, L. Die Quelle ist mono: Pad L (Pin 10) und G (Pin 7, 9) gehen per Leiterbahn direkt an J11, Pad R (Pin 8) bleibt unbenutzt (No-Connect). Kein Mono-Mix, keine Mischwiderstaende.</w:t>
+      </w:r>
+    </w:p>
+    <w:p>
+      <w:pPr>
+        <w:pStyle w:val="ListParagraph"/>
+        <w:numPr>
+          <w:ilvl w:val="0"/>
+          <w:numId w:val="2"/>
+        </w:numPr>
+      </w:pPr>
+      <w:r>
+        <w:t xml:space="preserve">J11 TPA3118-Modul (HW-327), wird auf die Platine geloetet: Pad 1 IN, 2 GND, 3 PWR+ (VLOAD), 4 PWR- (GND), 5 OUT+ und 6 OUT- (zu CN4); die MUTE-Pads bleiben offen</w:t>
+      </w:r>
+    </w:p>
+    <w:p>
+      <w:pPr>
+        <w:pStyle w:val="ListParagraph"/>
+        <w:numPr>
+          <w:ilvl w:val="0"/>
+          <w:numId w:val="2"/>
+        </w:numPr>
+      </w:pPr>
+      <w:r>
+        <w:t xml:space="preserve">J9 microSD-Modul (6 Pins, VCC an 3V3 des ESP32-Boards, eigener Footprint mit Befestigungsloechern)</w:t>
       </w:r>
     </w:p>
     <w:p>
@@ -815,18 +701,6 @@
         </w:numPr>
       </w:pPr>
       <w:r>
-        <w:t xml:space="preserve">Nur eine Audio-Variante bestuecken. Die I2S-Leitungen gehen parallel an beide Modulplaetze.</w:t>
-      </w:r>
-    </w:p>
-    <w:p>
-      <w:pPr>
-        <w:pStyle w:val="ListParagraph"/>
-        <w:numPr>
-          <w:ilvl w:val="0"/>
-          <w:numId w:val="2"/>
-        </w:numPr>
-      </w:pPr>
-      <w:r>
         <w:t xml:space="preserve">Gesperrte GPIOs: IO0/3/45/46 (Strapping), IO19/20 (USB), IO26-37 (Flash/PSRAM), IO43/44 (UART0). IO38/48 je nach Board an der RGB-LED.</w:t>
       </w:r>
     </w:p>
@@ -839,7 +713,7 @@
         </w:numPr>
       </w:pPr>
       <w:r>
-        <w:t xml:space="preserve">Footprint ESP32-S3-DevKitC-1_THT mit Reihenabstand 25,4 mm. Vor dem Layout am echten Board nachmessen.</w:t>
+        <w:t xml:space="preserve">Footprint ESP32-S3-DevKitC-1_THT mit Reihenabstand 25,4 mm. Vor dem Layout am echten Board nachmessen. Eigene Footprints fuer PCM5102A, microSD-Modul und TPA3118-Modul liegen in hardware/footprints.pretty; die Masse sind aus Fotos geschaetzt und vor dem Layout nachzumessen.</w:t>
       </w:r>
     </w:p>
     <w:p>
@@ -983,7 +857,7 @@
         </w:numPr>
       </w:pPr>
       <w:r>
-        <w:t xml:space="preserve">Hardware: Schaltplan vorhanden, PCB noch leer. ERC: 1 Fehler (3V3 von U1 und PWR_FLAG beide Power output) und 65 Warnungen, siehe hardware/ERC.rpt.</w:t>
+        <w:t xml:space="preserve">Hardware: Schaltplan v0.8, PCB in Arbeit. ERC-Stand v0.3 (hardware/ERC.rpt): 1 Fehler (IO8 unbeschaltet, seit v0.4 mit No-Connect-Flag, plus Rest-Leitungsstueck entfernt) und 55 Warnungen (Bibliotheksversionen "power"/"Device"/"local", harmlos). Nach v0.8 ERC neu ausfuehren.</w:t>
       </w:r>
     </w:p>
     <w:p>
@@ -1015,7 +889,55 @@
         </w:numPr>
       </w:pPr>
       <w:r>
-        <w:t xml:space="preserve">ERC-Fehler beheben (PWR_FLAG an 3V3 entfernen) und Symbolbibliothek "local" einbinden</w:t>
+        <w:t xml:space="preserve">Schaltplan v0.8 im PCB per F8 (Aktualisieren aus Schaltplan) uebernehmen: J10, R18, R19, J3, J4, R17, J7, J8 entfallen (Footprints ohne Symbol loeschen lassen), J2, J9 und J11 bekommen die neuen Modul-Footprints (J11 jetzt TPA3118 mit 6 Pads), CN3 entfaellt, CN4 (Lautsprecher) ist neu. hardware/*.pdf ist noch der Stand v0.1.</w:t>
+      </w:r>
+    </w:p>
+    <w:p>
+      <w:pPr>
+        <w:pStyle w:val="ListParagraph"/>
+        <w:numPr>
+          <w:ilvl w:val="0"/>
+          <w:numId w:val="2"/>
+        </w:numPr>
+      </w:pPr>
+      <w:r>
+        <w:t xml:space="preserve">ERC mit v0.8 neu ausfuehren; Symbolbibliothek "local" einbinden (reduziert die Warnungen).</w:t>
+      </w:r>
+    </w:p>
+    <w:p>
+      <w:pPr>
+        <w:pStyle w:val="ListParagraph"/>
+        <w:numPr>
+          <w:ilvl w:val="0"/>
+          <w:numId w:val="2"/>
+        </w:numPr>
+      </w:pPr>
+      <w:r>
+        <w:t xml:space="preserve">TPA3118-Modul (HW-327): Modul-Mindestspannung 8 V beachten (3S-Akku nicht unter ca. 9 V entladen, Abschaltung ueber Fahrregler/Unterspannungswaechter), MUTE-Header offen, Leiterbahnbreite und Stromaufnahme gegen CN2/CN4 (JST PH, ca. 2 A je Kontakt) pruefen.</w:t>
+      </w:r>
+    </w:p>
+    <w:p>
+      <w:pPr>
+        <w:pStyle w:val="ListParagraph"/>
+        <w:numPr>
+          <w:ilvl w:val="0"/>
+          <w:numId w:val="2"/>
+        </w:numPr>
+      </w:pPr>
+      <w:r>
+        <w:t xml:space="preserve">microSD-Modul muss ein reines 3,3-V-Modul sein (Standard-Module mit Spannungsregler bekommen sonst zu wenig Spannung); Pinreihenfolge am Modul gegen J9 (VCC, CS, MOSI, SCK, MISO, GND) pruefen.</w:t>
+      </w:r>
+    </w:p>
+    <w:p>
+      <w:pPr>
+        <w:pStyle w:val="ListParagraph"/>
+        <w:numPr>
+          <w:ilvl w:val="0"/>
+          <w:numId w:val="2"/>
+        </w:numPr>
+      </w:pPr>
+      <w:r>
+        <w:t xml:space="preserve">Module nachmessen und Footprints anpassen: PCM5102A, microSD-Modul, TPA3118 (Padlage, Befestigungsloecher, Belegung IN/GND per Multimeter pruefen), ESP32-S3-DevKitC-1.</w:t>
       </w:r>
     </w:p>
     <w:p>
@@ -1028,18 +950,6 @@
       </w:pPr>
       <w:r>
         <w:t xml:space="preserve">PCB-Layout erstellen</w:t>
-      </w:r>
-    </w:p>
-    <w:p>
-      <w:pPr>
-        <w:pStyle w:val="ListParagraph"/>
-        <w:numPr>
-          <w:ilvl w:val="0"/>
-          <w:numId w:val="2"/>
-        </w:numPr>
-      </w:pPr>
-      <w:r>
-        <w:t xml:space="preserve">Footprint am echten Board nachmessen</w:t>
       </w:r>
     </w:p>
     <w:p>

</xml_diff>

<commit_message>
Widerstandswerte R1-R16 entfernt, Anwender legt sie aus
- R1-R16 ohne Wert (Schaltplan + PCB), Hinweis im Schaltplan angepasst
- Projektbeschreibung, README, README-hardware: Anwender legt Werte selbst aus, LED-Empfehlung im Schaltplan
- D1 P6KE15A und 3S-Versorgung bleiben (TPA3118 braucht >= 8 V)

Co-Authored-By: Claude Opus 5.5 (1M context) <noreply@anthropic.com>
Claude-Session: https://claude.ai/code/session_015ZTAHN4h1MhX6WfGWCfmx3
</commit_message>
<xml_diff>
--- a/docs/Projektbeschreibung.docx
+++ b/docs/Projektbeschreibung.docx
@@ -23,7 +23,7 @@
           <w:iCs/>
           <w:color w:val="666666"/>
         </w:rPr>
-        <w:t xml:space="preserve">Projektbeschreibung, Stand 17.10.2026, Hardware v0.8 (Entwurf, nur Schaltplan)</w:t>
+        <w:t xml:space="preserve">Projektbeschreibung, Stand 18.10.2026, Hardware v0.8 (Entwurf, nur Schaltplan)</w:t>
       </w:r>
     </w:p>
     <w:p>
@@ -163,19 +163,19 @@
         </w:numPr>
       </w:pPr>
       <w:r>
-        <w:t xml:space="preserve">R9-R16 (THT 1/4 W, Standard 150 R) zwischen ULN-Ausgang und Stiftleiste J1, je nach Verbraucher waehlen.</w:t>
-      </w:r>
-    </w:p>
-    <w:p>
-      <w:pPr>
-        <w:pStyle w:val="ListParagraph"/>
-        <w:numPr>
-          <w:ilvl w:val="0"/>
-          <w:numId w:val="2"/>
-        </w:numPr>
-      </w:pPr>
-      <w:r>
-        <w:t xml:space="preserve">R1-R8 und LED1-LED8 (3 mm) als Kontroll-LED je Kanal, vom Steuersignal Sn gegen GND.</w:t>
+        <w:t xml:space="preserve">R9-R16 (THT 1/4 W) zwischen ULN-Ausgang und Stiftleiste J1: Es ist kein Wert vorgegeben. Der Anwender muss die Widerstaende selbst passend zu Verbraucher und Lastspannung (3S, 9-12,6 V) auslegen, Strom und Verlustleistung beachten.</w:t>
+      </w:r>
+    </w:p>
+    <w:p>
+      <w:pPr>
+        <w:pStyle w:val="ListParagraph"/>
+        <w:numPr>
+          <w:ilvl w:val="0"/>
+          <w:numId w:val="2"/>
+        </w:numPr>
+      </w:pPr>
+      <w:r>
+        <w:t xml:space="preserve">R1-R8 und LED1-LED8 (3 mm) als Kontroll-LED je Kanal, vom Steuersignal Sn (3,3 V) gegen GND. Auch hier legt der Anwender die Werte selbst fest. Eine Empfehlung fuer die Kontroll-LEDs steht im Schaltplan.</w:t>
       </w:r>
     </w:p>
     <w:p>

</xml_diff>

<commit_message>
Doku: README, firmware/README und Projektbeschreibung fuer Firmware v1.00
Co-Authored-By: Claude Opus 5.5 <noreply@anthropic.com>
Claude-Session: https://claude.ai/code/session_0118D4qsV1nAfMEzonwsrZXB
</commit_message>
<xml_diff>
--- a/docs/Projektbeschreibung.docx
+++ b/docs/Projektbeschreibung.docx
@@ -23,7 +23,7 @@
           <w:iCs/>
           <w:color w:val="666666"/>
         </w:rPr>
-        <w:t xml:space="preserve">Projektbeschreibung, Stand 18.10.2026, Hardware v0.8 (Entwurf, nur Schaltplan)</w:t>
+        <w:t>Projektbeschreibung, Stand 28.10.2026, Hardware v0.9, Firmware v1.00 (nicht auf Hardware getestet)</w:t>
       </w:r>
     </w:p>
     <w:p>
@@ -733,55 +733,103 @@
         <w:pStyle w:val="Heading1"/>
       </w:pPr>
       <w:r>
-        <w:t xml:space="preserve">Firmware (geplant)</w:t>
-      </w:r>
-    </w:p>
-    <w:p>
-      <w:pPr>
-        <w:pStyle w:val="ListParagraph"/>
-        <w:numPr>
-          <w:ilvl w:val="0"/>
-          <w:numId w:val="2"/>
-        </w:numPr>
-      </w:pPr>
-      <w:r>
-        <w:t xml:space="preserve">CRSF als einziges Protokoll, busfaehig ueber die UART-Anschluesse (Eingang plus Weiterleitung zum naechsten Modul).</w:t>
-      </w:r>
-    </w:p>
-    <w:p>
-      <w:pPr>
-        <w:pStyle w:val="ListParagraph"/>
-        <w:numPr>
-          <w:ilvl w:val="0"/>
-          <w:numId w:val="2"/>
-        </w:numPr>
-      </w:pPr>
-      <w:r>
-        <w:t xml:space="preserve">Gemeinsame CRSF-Bibliothek als Kopie im Projekt (firmware/lib), keine externe Abhaengigkeit.</w:t>
-      </w:r>
-    </w:p>
-    <w:p>
-      <w:pPr>
-        <w:pStyle w:val="ListParagraph"/>
-        <w:numPr>
-          <w:ilvl w:val="0"/>
-          <w:numId w:val="2"/>
-        </w:numPr>
-      </w:pPr>
-      <w:r>
-        <w:t xml:space="preserve">Einstellung der Adresse und Parameter ueber CRSF-Parameter (Lua am Sender) und Web-UI.</w:t>
-      </w:r>
-    </w:p>
-    <w:p>
-      <w:pPr>
-        <w:pStyle w:val="ListParagraph"/>
-        <w:numPr>
-          <w:ilvl w:val="0"/>
-          <w:numId w:val="2"/>
-        </w:numPr>
-      </w:pPr>
-      <w:r>
-        <w:t xml:space="preserve">Build mit PlatformIO, Bauweise wie bei den Sound-Mini-Repos.</w:t>
+        <w:t>Firmware (v1.00)</w:t>
+      </w:r>
+    </w:p>
+    <w:p>
+      <w:pPr>
+        <w:pStyle w:val="ListParagraph"/>
+        <w:numPr>
+          <w:ilvl w:val="0"/>
+          <w:numId w:val="2"/>
+        </w:numPr>
+      </w:pPr>
+      <w:r>
+        <w:t>Arduino-Sketch firmware/RC_Multiswitch_Sound (Arduino IDE, Core esp32 3.0.7; Bibliotheken SBUS 8.1.4 und TinyGPSPlus 1.0.3). Build und fertige .bin-Dateien ueber GitHub Actions. Board "ESP32S3 Dev Module", USB CDC On Boot Enabled, Partition Scheme "Minimal SPIFFS (1.9MB APP with OTA/128KB SPIFFS)".</w:t>
+      </w:r>
+    </w:p>
+    <w:p>
+      <w:pPr>
+        <w:pStyle w:val="ListParagraph"/>
+        <w:numPr>
+          <w:ilvl w:val="0"/>
+          <w:numId w:val="2"/>
+        </w:numPr>
+      </w:pPr>
+      <w:r>
+        <w:t>Reine Zusammenfuehrung: Schaltteil aus RC-Multiswitch-ESP32-S3 v4.06 (= Multiswitch-Basis V3/TXRX von Ziege-One), Soundteil aus ESP32-Sound-Basis_Ziege-One v7.21 (Motor start/loop/shut und 24 Sounds von der SD-Karte, I2S an PCM5102A).</w:t>
+      </w:r>
+    </w:p>
+    <w:p>
+      <w:pPr>
+        <w:pStyle w:val="ListParagraph"/>
+        <w:numPr>
+          <w:ilvl w:val="0"/>
+          <w:numId w:val="2"/>
+        </w:numPr>
+      </w:pPr>
+      <w:r>
+        <w:t>Gemeinsam fuer beide Teile: RC-System (CRSF oder SBUS auf UART A), MKan-Gruppen, WLAN und Web-UI, Lua-Menue am Sender (nur CRSF), UART B/C mit Rolle CRSF-Modulkette, S.Port, GPS oder Raw, Firmware-Update per WLAN, Einstellungs-Backup im Flash und auf der SD-Karte. Gemeinsame Basis RC_Common 1.2.0 als unveraenderte Kopie.</w:t>
+      </w:r>
+    </w:p>
+    <w:p>
+      <w:pPr>
+        <w:pStyle w:val="ListParagraph"/>
+        <w:numPr>
+          <w:ilvl w:val="0"/>
+          <w:numId w:val="2"/>
+        </w:numPr>
+      </w:pPr>
+      <w:r>
+        <w:t>Zwei Adressen: Schalt-Adresse fuer die Ausgaenge (zugleich CRSF-Geraeteadresse 0xC0 + Adresse) und Sound-Adresse fuer die Einzelkanal-Sounds. Gleiche Zahl bedeutet: dieselben Schalter schalten Ausgaenge und Sounds.</w:t>
+      </w:r>
+    </w:p>
+    <w:p>
+      <w:pPr>
+        <w:pStyle w:val="ListParagraph"/>
+        <w:numPr>
+          <w:ilvl w:val="0"/>
+          <w:numId w:val="2"/>
+        </w:numPr>
+      </w:pPr>
+      <w:r>
+        <w:t>Status-LED (RGB-LED des DevKitC-1) in der Web-UI waehlbar: IO48 (Board v1.0, Vorgabe) oder IO38 (Board v1.1).</w:t>
+      </w:r>
+    </w:p>
+    <w:p>
+      <w:pPr>
+        <w:pStyle w:val="ListParagraph"/>
+        <w:numPr>
+          <w:ilvl w:val="0"/>
+          <w:numId w:val="2"/>
+        </w:numPr>
+      </w:pPr>
+      <w:r>
+        <w:t>Lua-Menue: Felder 0-85 wie RC-Multiswitch, 86-98 Motor, 99-111 Einstellungen und Geraetename, ab 112 die Sounds. Vorgabe 8 Sounds, in der Web-UI auf 12, 16, 20 oder 23 erhoehbar. Mehr als 23 passen nicht (hoechstens 255 Lua-Felder); in der Web-UI sind immer alle 24 Sounds einstellbar.</w:t>
+      </w:r>
+    </w:p>
+    <w:p>
+      <w:pPr>
+        <w:pStyle w:val="ListParagraph"/>
+        <w:numPr>
+          <w:ilvl w:val="0"/>
+          <w:numId w:val="2"/>
+        </w:numPr>
+      </w:pPr>
+      <w:r>
+        <w:t>Namen: Ausgaenge "Ausgang 1" bis "Ausgang 8", Sounds "Sound 1" bis "Sound 24", je 16 Zeichen in der Web-UI aenderbar, Anzeige "Nummer Name". Lua-Ordner behalten feste Namen.</w:t>
+      </w:r>
+    </w:p>
+    <w:p>
+      <w:pPr>
+        <w:pStyle w:val="ListParagraph"/>
+        <w:numPr>
+          <w:ilvl w:val="0"/>
+          <w:numId w:val="2"/>
+        </w:numPr>
+      </w:pPr>
+      <w:r>
+        <w:t>Export als Datei, Flash-Backup und SD-Sicherung enthalten Schalt- und Soundteil. Sicherungen vom Multiswitch oder von der Sound-Basis lassen sich ebenfalls einspielen (jeweils nur ihr Teil).</w:t>
       </w:r>
     </w:p>
     <w:p>
@@ -813,7 +861,7 @@
         </w:numPr>
       </w:pPr>
       <w:r>
-        <w:t xml:space="preserve">firmware/: Firmware (PlatformIO), noch nicht begonnen</w:t>
+        <w:t>firmware/: Firmware (Arduino-Sketch RC_Multiswitch_Sound), Beschreibung in firmware/README.md</w:t>
       </w:r>
     </w:p>
     <w:p>
@@ -869,7 +917,7 @@
         </w:numPr>
       </w:pPr>
       <w:r>
-        <w:t xml:space="preserve">Firmware: noch nicht begonnen. Basis kann die Sound-Mini-Firmware (ESP32-Sound-Mini-S3) sein.</w:t>
+        <w:t>Firmware: v1.00 baut in GitHub Actions, auf der Platine noch nicht getestet.</w:t>
       </w:r>
     </w:p>
     <w:p>
@@ -961,7 +1009,7 @@
         </w:numPr>
       </w:pPr>
       <w:r>
-        <w:t xml:space="preserve">Firmware schreiben (Multiswitch + Sound)</w:t>
+        <w:t>Firmware v1.00 auf der Platine testen: Ausgaenge, Sound und SD-Karte, Status-LED IO48/IO38, Lua-Menue, Modulkette.</w:t>
       </w:r>
     </w:p>
     <w:sectPr>

</xml_diff>

<commit_message>
Hardware: TBD62083APG statt ULN2803A
ULN2803A ist abgekuendigt. Der TBD62083APG (DMOS) hat dieselbe Pinbelegung und passt in denselben Sockel, Leiterbahnen und Netze bleiben unveraendert. Schaltplan-Symbol, Bauteilwert, Bestueckungsdruck und Doku angepasst.

Co-Authored-By: Claude Opus 5.5 <noreply@anthropic.com>
Claude-Session: https://claude.ai/code/session_0118D4qppRkb6gR5m3R2CZyV
</commit_message>
<xml_diff>
--- a/docs/Projektbeschreibung.docx
+++ b/docs/Projektbeschreibung.docx
@@ -47,7 +47,7 @@
         <w:spacing w:after="120"/>
       </w:pPr>
       <w:r>
-        <w:t>Kombiniert den RC-Multiswitch mit einem Soundmodul auf einer Platine: 8 Schaltkanaele ueber ULN2803A und Soundausgabe ueber I2S, Sounds von microSD. Ziel ist ein Modul fuer Modelle, die Licht und Sound zusammen brauchen.</w:t>
+        <w:t>Kombiniert den RC-Multiswitch mit einem Soundmodul auf einer Platine: 8 Schaltkanaele ueber TBD62083APG und Soundausgabe ueber I2S, Sounds von microSD. Ziel ist ein Modul fuer Modelle, die Licht und Sound zusammen brauchen.</w:t>
       </w:r>
     </w:p>
     <w:p>
@@ -67,7 +67,7 @@
         </w:numPr>
       </w:pPr>
       <w:r>
-        <w:t xml:space="preserve">8 Schaltkanaele ueber ULN2803A, Kontroll-LED je Kanal</w:t>
+        <w:t>8 Schaltkanaele ueber TBD62083APG, Kontroll-LED je Kanal</w:t>
       </w:r>
     </w:p>
     <w:p>
@@ -151,19 +151,19 @@
         </w:numPr>
       </w:pPr>
       <w:r>
-        <w:t xml:space="preserve">Treiber ULN2803A, 8 Kanaele, max. 500 mA je Kanal (Verlustleistung des ULN2803A bei mehreren Kanaelen beachten).</w:t>
-      </w:r>
-    </w:p>
-    <w:p>
-      <w:pPr>
-        <w:pStyle w:val="ListParagraph"/>
-        <w:numPr>
-          <w:ilvl w:val="0"/>
-          <w:numId w:val="2"/>
-        </w:numPr>
-      </w:pPr>
-      <w:r>
-        <w:t xml:space="preserve">R9-R16 (THT 1/4 W) zwischen ULN-Ausgang und Stiftleiste J1: Es ist kein Wert vorgegeben. Der Anwender muss die Widerstaende selbst passend zu Verbraucher und Lastspannung (3S, 9-12,6 V) auslegen, Strom und Verlustleistung beachten.</w:t>
+        <w:t>Treiber TBD62083APG (DMOS, Nachfolger des ULN2803A, gleiche Pinbelegung; ein ULN2803A passt weiterhin in den Sockel), 8 Kanaele, max. 500 mA je Kanal, Summe aller Kanaele ca. 1,5 A. Spannungsabfall am Ausgang nur ca. 0,2-0,4 V statt ca. 1 V beim ULN2803A.</w:t>
+      </w:r>
+    </w:p>
+    <w:p>
+      <w:pPr>
+        <w:pStyle w:val="ListParagraph"/>
+        <w:numPr>
+          <w:ilvl w:val="0"/>
+          <w:numId w:val="2"/>
+        </w:numPr>
+      </w:pPr>
+      <w:r>
+        <w:t>R9-R16 (THT 1/4 W) zwischen Treiber-Ausgang und Stiftleiste J1: Es ist kein Wert vorgegeben. Der Anwender muss die Widerstaende selbst passend zu Verbraucher und Lastspannung (3S, 9-12,6 V) auslegen, Strom und Verlustleistung beachten.</w:t>
       </w:r>
     </w:p>
     <w:p>

</xml_diff>